<commit_message>
Add final viva submission artifacts
</commit_message>
<xml_diff>
--- a/output/assignment2_reports/Chelaka_Assignment_2_Responsible_AI_and_Bias_Assessment_Final.docx
+++ b/output/assignment2_reports/Chelaka_Assignment_2_Responsible_AI_and_Bias_Assessment_Final.docx
@@ -98,6 +98,58 @@
     <w:p>
       <w:r>
         <w:t>Scope note: Tests were run against temporary local databases and mocked agent/model transports where needed. They do not modify the student's real demo account database.</w:t>
+      </w:r>
+    </w:p>
+    <w:p>
+      <w:r>
+        <w:rPr>
+          <w:b/>
+        </w:rPr>
+        <w:t>Live system proof:</w:t>
+      </w:r>
+      <w:r>
+        <w:t xml:space="preserve"> The screenshot below was captured after checking the gateway, four worker agents and frontend on the local machine. It also records the automated checks used as assessment evidence.</w:t>
+      </w:r>
+    </w:p>
+    <w:p>
+      <w:r>
+        <w:drawing>
+          <wp:inline xmlns:a="http://schemas.openxmlformats.org/drawingml/2006/main" xmlns:pic="http://schemas.openxmlformats.org/drawingml/2006/picture">
+            <wp:extent cx="6446520" cy="1442272"/>
+            <wp:docPr id="1" name="Picture 1"/>
+            <wp:cNvGraphicFramePr>
+              <a:graphicFrameLocks noChangeAspect="1"/>
+            </wp:cNvGraphicFramePr>
+            <a:graphic>
+              <a:graphicData uri="http://schemas.openxmlformats.org/drawingml/2006/picture">
+                <pic:pic>
+                  <pic:nvPicPr>
+                    <pic:cNvPr id="0" name="live_system_proof.png"/>
+                    <pic:cNvPicPr/>
+                  </pic:nvPicPr>
+                  <pic:blipFill>
+                    <a:blip r:embed="rId9"/>
+                    <a:stretch>
+                      <a:fillRect/>
+                    </a:stretch>
+                  </pic:blipFill>
+                  <pic:spPr>
+                    <a:xfrm>
+                      <a:off x="0" y="0"/>
+                      <a:ext cx="6446520" cy="1442272"/>
+                    </a:xfrm>
+                    <a:prstGeom prst="rect"/>
+                  </pic:spPr>
+                </pic:pic>
+              </a:graphicData>
+            </a:graphic>
+          </wp:inline>
+        </w:drawing>
+      </w:r>
+    </w:p>
+    <w:p>
+      <w:r>
+        <w:br w:type="page"/>
       </w:r>
     </w:p>
     <w:p>

</xml_diff>